<commit_message>
Regenerate all resumes with fixed generator (experience + publications now populated)
</commit_message>
<xml_diff>
--- a/90d2be1928184766/Vidhya_Parameswaran_Resume_AbbVie_20260325.docx
+++ b/90d2be1928184766/Vidhya_Parameswaran_Resume_AbbVie_20260325.docx
@@ -180,6 +180,606 @@
           <w:bottom w:val="single" w:sz="6" w:space="1" w:color="0D666E"/>
         </w:pBdr>
       </w:pPr>
+    </w:p>
+    <w:p>
+      <w:pPr>
+        <w:spacing w:before="120" w:after="20"/>
+      </w:pPr>
+      <w:r>
+        <w:rPr>
+          <w:rFonts w:ascii="Calibri" w:hAnsi="Calibri"/>
+          <w:b/>
+          <w:color w:val="1A1A1A"/>
+          <w:sz w:val="20"/>
+        </w:rPr>
+        <w:t>Director, Medical Affairs — Epidemiology &amp; RWE</w:t>
+      </w:r>
+      <w:r>
+        <w:rPr>
+          <w:rFonts w:ascii="Calibri" w:hAnsi="Calibri"/>
+          <w:color w:val="555555"/>
+          <w:sz w:val="20"/>
+        </w:rPr>
+        <w:t xml:space="preserve"> | </w:t>
+      </w:r>
+      <w:r>
+        <w:rPr>
+          <w:rFonts w:ascii="Calibri" w:hAnsi="Calibri"/>
+          <w:color w:val="1A1A1A"/>
+          <w:sz w:val="20"/>
+        </w:rPr>
+        <w:t>Kiniksa Pharmaceuticals</w:t>
+      </w:r>
+    </w:p>
+    <w:p>
+      <w:pPr>
+        <w:spacing w:before="0" w:after="40"/>
+      </w:pPr>
+      <w:r>
+        <w:rPr>
+          <w:rFonts w:ascii="Calibri" w:hAnsi="Calibri"/>
+          <w:i/>
+          <w:color w:val="555555"/>
+          <w:sz w:val="18"/>
+        </w:rPr>
+        <w:t>Jul 2023 – Present</w:t>
+      </w:r>
+    </w:p>
+    <w:p>
+      <w:pPr>
+        <w:pStyle w:val="ListBullet"/>
+        <w:spacing w:before="0" w:after="20" w:line="260" w:lineRule="exact"/>
+      </w:pPr>
+      <w:r>
+        <w:rPr>
+          <w:rFonts w:ascii="Calibri" w:hAnsi="Calibri"/>
+          <w:color w:val="1A1A1A"/>
+          <w:sz w:val="20"/>
+        </w:rPr>
+        <w:t>Develop study concepts and execute studies of incidence/prevalence, burden of illness, and natural history of disease for business development and early development indications</w:t>
+      </w:r>
+    </w:p>
+    <w:p>
+      <w:pPr>
+        <w:pStyle w:val="ListBullet"/>
+        <w:spacing w:before="0" w:after="20" w:line="260" w:lineRule="exact"/>
+      </w:pPr>
+      <w:r>
+        <w:rPr>
+          <w:rFonts w:ascii="Calibri" w:hAnsi="Calibri"/>
+          <w:color w:val="1A1A1A"/>
+          <w:sz w:val="20"/>
+        </w:rPr>
+        <w:t>Provide strategic and tactical support for cross-functional RWE development including registries, burden of illness/natural history of disease for regulators, payers, and clinicians</w:t>
+      </w:r>
+    </w:p>
+    <w:p>
+      <w:pPr>
+        <w:pStyle w:val="ListBullet"/>
+        <w:spacing w:before="0" w:after="20" w:line="260" w:lineRule="exact"/>
+      </w:pPr>
+      <w:r>
+        <w:rPr>
+          <w:rFonts w:ascii="Calibri" w:hAnsi="Calibri"/>
+          <w:color w:val="1A1A1A"/>
+          <w:sz w:val="20"/>
+        </w:rPr>
+        <w:t>Establish innovative methods and integrate into HEOR, global safety, and medical affairs observational research</w:t>
+      </w:r>
+    </w:p>
+    <w:p>
+      <w:pPr>
+        <w:pStyle w:val="ListBullet"/>
+        <w:spacing w:before="0" w:after="20" w:line="260" w:lineRule="exact"/>
+      </w:pPr>
+      <w:r>
+        <w:rPr>
+          <w:rFonts w:ascii="Calibri" w:hAnsi="Calibri"/>
+          <w:color w:val="1A1A1A"/>
+          <w:sz w:val="20"/>
+        </w:rPr>
+        <w:t>Adapt performance metrics and dashboards for RWE projects within cardiology and immunology therapeutic areas</w:t>
+      </w:r>
+    </w:p>
+    <w:p>
+      <w:pPr>
+        <w:spacing w:before="120" w:after="20"/>
+      </w:pPr>
+      <w:r>
+        <w:rPr>
+          <w:rFonts w:ascii="Calibri" w:hAnsi="Calibri"/>
+          <w:b/>
+          <w:color w:val="1A1A1A"/>
+          <w:sz w:val="20"/>
+        </w:rPr>
+        <w:t>Associate Director, Oncology Outcomes Research</w:t>
+      </w:r>
+      <w:r>
+        <w:rPr>
+          <w:rFonts w:ascii="Calibri" w:hAnsi="Calibri"/>
+          <w:color w:val="555555"/>
+          <w:sz w:val="20"/>
+        </w:rPr>
+        <w:t xml:space="preserve"> | </w:t>
+      </w:r>
+      <w:r>
+        <w:rPr>
+          <w:rFonts w:ascii="Calibri" w:hAnsi="Calibri"/>
+          <w:color w:val="1A1A1A"/>
+          <w:sz w:val="20"/>
+        </w:rPr>
+        <w:t>AstraZeneca</w:t>
+      </w:r>
+    </w:p>
+    <w:p>
+      <w:pPr>
+        <w:spacing w:before="0" w:after="40"/>
+      </w:pPr>
+      <w:r>
+        <w:rPr>
+          <w:rFonts w:ascii="Calibri" w:hAnsi="Calibri"/>
+          <w:i/>
+          <w:color w:val="555555"/>
+          <w:sz w:val="18"/>
+        </w:rPr>
+        <w:t>Jan 2023 – Jul 2023</w:t>
+      </w:r>
+    </w:p>
+    <w:p>
+      <w:pPr>
+        <w:pStyle w:val="ListBullet"/>
+        <w:spacing w:before="0" w:after="20" w:line="260" w:lineRule="exact"/>
+      </w:pPr>
+      <w:r>
+        <w:rPr>
+          <w:rFonts w:ascii="Calibri" w:hAnsi="Calibri"/>
+          <w:color w:val="1A1A1A"/>
+          <w:sz w:val="20"/>
+        </w:rPr>
+        <w:t>Led development and execution of global business strategy through evidence generation for AZ's ADC lung cancer portfolio</w:t>
+      </w:r>
+    </w:p>
+    <w:p>
+      <w:pPr>
+        <w:pStyle w:val="ListBullet"/>
+        <w:spacing w:before="0" w:after="20" w:line="260" w:lineRule="exact"/>
+      </w:pPr>
+      <w:r>
+        <w:rPr>
+          <w:rFonts w:ascii="Calibri" w:hAnsi="Calibri"/>
+          <w:color w:val="1A1A1A"/>
+          <w:sz w:val="20"/>
+        </w:rPr>
+        <w:t>Directed design, execution, analysis, and communication of HEOR, RWE, and epidemiological studies supporting medical affairs and access strategy</w:t>
+      </w:r>
+    </w:p>
+    <w:p>
+      <w:pPr>
+        <w:pStyle w:val="ListBullet"/>
+        <w:spacing w:before="0" w:after="20" w:line="260" w:lineRule="exact"/>
+      </w:pPr>
+      <w:r>
+        <w:rPr>
+          <w:rFonts w:ascii="Calibri" w:hAnsi="Calibri"/>
+          <w:color w:val="1A1A1A"/>
+          <w:sz w:val="20"/>
+        </w:rPr>
+        <w:t>Served as expert on RWE methods and cancer epidemiology for clinical development and commercialization of first-in-class therapeutic agents</w:t>
+      </w:r>
+    </w:p>
+    <w:p>
+      <w:pPr>
+        <w:pStyle w:val="ListBullet"/>
+        <w:spacing w:before="0" w:after="20" w:line="260" w:lineRule="exact"/>
+      </w:pPr>
+      <w:r>
+        <w:rPr>
+          <w:rFonts w:ascii="Calibri" w:hAnsi="Calibri"/>
+          <w:color w:val="1A1A1A"/>
+          <w:sz w:val="20"/>
+        </w:rPr>
+        <w:t>Provided specialized recommendations to project execution teams and senior leaders on high-impact project opportunities and risks</w:t>
+      </w:r>
+    </w:p>
+    <w:p>
+      <w:pPr>
+        <w:spacing w:before="120" w:after="20"/>
+      </w:pPr>
+      <w:r>
+        <w:rPr>
+          <w:rFonts w:ascii="Calibri" w:hAnsi="Calibri"/>
+          <w:b/>
+          <w:color w:val="1A1A1A"/>
+          <w:sz w:val="20"/>
+        </w:rPr>
+        <w:t>Associate Director, Global Real World Evidence Strategy</w:t>
+      </w:r>
+      <w:r>
+        <w:rPr>
+          <w:rFonts w:ascii="Calibri" w:hAnsi="Calibri"/>
+          <w:color w:val="555555"/>
+          <w:sz w:val="20"/>
+        </w:rPr>
+        <w:t xml:space="preserve"> | </w:t>
+      </w:r>
+      <w:r>
+        <w:rPr>
+          <w:rFonts w:ascii="Calibri" w:hAnsi="Calibri"/>
+          <w:color w:val="1A1A1A"/>
+          <w:sz w:val="20"/>
+        </w:rPr>
+        <w:t>AstraZeneca</w:t>
+      </w:r>
+    </w:p>
+    <w:p>
+      <w:pPr>
+        <w:spacing w:before="0" w:after="40"/>
+      </w:pPr>
+      <w:r>
+        <w:rPr>
+          <w:rFonts w:ascii="Calibri" w:hAnsi="Calibri"/>
+          <w:i/>
+          <w:color w:val="555555"/>
+          <w:sz w:val="18"/>
+        </w:rPr>
+        <w:t>Jan 2022 – Jan 2023</w:t>
+      </w:r>
+    </w:p>
+    <w:p>
+      <w:pPr>
+        <w:pStyle w:val="ListBullet"/>
+        <w:spacing w:before="0" w:after="20" w:line="260" w:lineRule="exact"/>
+      </w:pPr>
+      <w:r>
+        <w:rPr>
+          <w:rFonts w:ascii="Calibri" w:hAnsi="Calibri"/>
+          <w:color w:val="1A1A1A"/>
+          <w:sz w:val="20"/>
+        </w:rPr>
+        <w:t>Led creation and prioritization of medical evidence generation strategies for early and late-stage lung cancer</w:t>
+      </w:r>
+    </w:p>
+    <w:p>
+      <w:pPr>
+        <w:pStyle w:val="ListBullet"/>
+        <w:spacing w:before="0" w:after="20" w:line="260" w:lineRule="exact"/>
+      </w:pPr>
+      <w:r>
+        <w:rPr>
+          <w:rFonts w:ascii="Calibri" w:hAnsi="Calibri"/>
+          <w:color w:val="1A1A1A"/>
+          <w:sz w:val="20"/>
+        </w:rPr>
+        <w:t>Worked with key stakeholders to identify evidence gaps and developed patient-centric research strategies for HCPs, payers, and patients</w:t>
+      </w:r>
+    </w:p>
+    <w:p>
+      <w:pPr>
+        <w:pStyle w:val="ListBullet"/>
+        <w:spacing w:before="0" w:after="20" w:line="260" w:lineRule="exact"/>
+      </w:pPr>
+      <w:r>
+        <w:rPr>
+          <w:rFonts w:ascii="Calibri" w:hAnsi="Calibri"/>
+          <w:color w:val="1A1A1A"/>
+          <w:sz w:val="20"/>
+        </w:rPr>
+        <w:t>Provided strategic partnership on evidence generation plans across US and global medical, commercial, market access, and R&amp;D RWE teams</w:t>
+      </w:r>
+    </w:p>
+    <w:p>
+      <w:pPr>
+        <w:pStyle w:val="ListBullet"/>
+        <w:spacing w:before="0" w:after="20" w:line="260" w:lineRule="exact"/>
+      </w:pPr>
+      <w:r>
+        <w:rPr>
+          <w:rFonts w:ascii="Calibri" w:hAnsi="Calibri"/>
+          <w:color w:val="1A1A1A"/>
+          <w:sz w:val="20"/>
+        </w:rPr>
+        <w:t>Led external engagement as ISPOR Methods Advisory member; provided recommendations on study design methodology for observational studies, HEOR, and epidemiological modeling</w:t>
+      </w:r>
+    </w:p>
+    <w:p>
+      <w:pPr>
+        <w:spacing w:before="120" w:after="20"/>
+      </w:pPr>
+      <w:r>
+        <w:rPr>
+          <w:rFonts w:ascii="Calibri" w:hAnsi="Calibri"/>
+          <w:b/>
+          <w:color w:val="1A1A1A"/>
+          <w:sz w:val="20"/>
+        </w:rPr>
+        <w:t>Senior Epidemiologist</w:t>
+      </w:r>
+      <w:r>
+        <w:rPr>
+          <w:rFonts w:ascii="Calibri" w:hAnsi="Calibri"/>
+          <w:color w:val="555555"/>
+          <w:sz w:val="20"/>
+        </w:rPr>
+        <w:t xml:space="preserve"> | </w:t>
+      </w:r>
+      <w:r>
+        <w:rPr>
+          <w:rFonts w:ascii="Calibri" w:hAnsi="Calibri"/>
+          <w:color w:val="1A1A1A"/>
+          <w:sz w:val="20"/>
+        </w:rPr>
+        <w:t>Fresenius Medical Care North America</w:t>
+      </w:r>
+    </w:p>
+    <w:p>
+      <w:pPr>
+        <w:spacing w:before="0" w:after="40"/>
+      </w:pPr>
+      <w:r>
+        <w:rPr>
+          <w:rFonts w:ascii="Calibri" w:hAnsi="Calibri"/>
+          <w:i/>
+          <w:color w:val="555555"/>
+          <w:sz w:val="18"/>
+        </w:rPr>
+        <w:t>Nov 2019 – Dec 2021</w:t>
+      </w:r>
+    </w:p>
+    <w:p>
+      <w:pPr>
+        <w:pStyle w:val="ListBullet"/>
+        <w:spacing w:before="0" w:after="20" w:line="260" w:lineRule="exact"/>
+      </w:pPr>
+      <w:r>
+        <w:rPr>
+          <w:rFonts w:ascii="Calibri" w:hAnsi="Calibri"/>
+          <w:color w:val="1A1A1A"/>
+          <w:sz w:val="20"/>
+        </w:rPr>
+        <w:t>Generated real-world evidence to support pre- and post-launch strategy for new and marketed cardiorenal products</w:t>
+      </w:r>
+    </w:p>
+    <w:p>
+      <w:pPr>
+        <w:pStyle w:val="ListBullet"/>
+        <w:spacing w:before="0" w:after="20" w:line="260" w:lineRule="exact"/>
+      </w:pPr>
+      <w:r>
+        <w:rPr>
+          <w:rFonts w:ascii="Calibri" w:hAnsi="Calibri"/>
+          <w:color w:val="1A1A1A"/>
+          <w:sz w:val="20"/>
+        </w:rPr>
+        <w:t>Developed study designs and statistical analysis protocols for retrospective/prospective observational studies, disease registries, EMR, and administrative claims data</w:t>
+      </w:r>
+    </w:p>
+    <w:p>
+      <w:pPr>
+        <w:pStyle w:val="ListBullet"/>
+        <w:spacing w:before="0" w:after="20" w:line="260" w:lineRule="exact"/>
+      </w:pPr>
+      <w:r>
+        <w:rPr>
+          <w:rFonts w:ascii="Calibri" w:hAnsi="Calibri"/>
+          <w:color w:val="1A1A1A"/>
+          <w:sz w:val="20"/>
+        </w:rPr>
+        <w:t>Managed IRB submissions and grant proposals</w:t>
+      </w:r>
+    </w:p>
+    <w:p>
+      <w:pPr>
+        <w:pStyle w:val="ListBullet"/>
+        <w:spacing w:before="0" w:after="20" w:line="260" w:lineRule="exact"/>
+      </w:pPr>
+      <w:r>
+        <w:rPr>
+          <w:rFonts w:ascii="Calibri" w:hAnsi="Calibri"/>
+          <w:color w:val="1A1A1A"/>
+          <w:sz w:val="20"/>
+        </w:rPr>
+        <w:t>Served as expert on epidemiological databases and methods; led data presentations to payers and HCPs at advisory board meetings</w:t>
+      </w:r>
+    </w:p>
+    <w:p>
+      <w:pPr>
+        <w:spacing w:before="120" w:after="20"/>
+      </w:pPr>
+      <w:r>
+        <w:rPr>
+          <w:rFonts w:ascii="Calibri" w:hAnsi="Calibri"/>
+          <w:b/>
+          <w:color w:val="1A1A1A"/>
+          <w:sz w:val="20"/>
+        </w:rPr>
+        <w:t>Epidemiologist</w:t>
+      </w:r>
+      <w:r>
+        <w:rPr>
+          <w:rFonts w:ascii="Calibri" w:hAnsi="Calibri"/>
+          <w:color w:val="555555"/>
+          <w:sz w:val="20"/>
+        </w:rPr>
+        <w:t xml:space="preserve"> | </w:t>
+      </w:r>
+      <w:r>
+        <w:rPr>
+          <w:rFonts w:ascii="Calibri" w:hAnsi="Calibri"/>
+          <w:color w:val="1A1A1A"/>
+          <w:sz w:val="20"/>
+        </w:rPr>
+        <w:t>Fresenius Medical Care Canada</w:t>
+      </w:r>
+    </w:p>
+    <w:p>
+      <w:pPr>
+        <w:spacing w:before="0" w:after="40"/>
+      </w:pPr>
+      <w:r>
+        <w:rPr>
+          <w:rFonts w:ascii="Calibri" w:hAnsi="Calibri"/>
+          <w:i/>
+          <w:color w:val="555555"/>
+          <w:sz w:val="18"/>
+        </w:rPr>
+        <w:t>Feb 2018 – Oct 2019</w:t>
+      </w:r>
+    </w:p>
+    <w:p>
+      <w:pPr>
+        <w:pStyle w:val="ListBullet"/>
+        <w:spacing w:before="0" w:after="20" w:line="260" w:lineRule="exact"/>
+      </w:pPr>
+      <w:r>
+        <w:rPr>
+          <w:rFonts w:ascii="Calibri" w:hAnsi="Calibri"/>
+          <w:color w:val="1A1A1A"/>
+          <w:sz w:val="20"/>
+        </w:rPr>
+        <w:t>Conducted systematic/targeted literature reviews and meta-analyses of renal therapies for regulatory submissions to Health Canada</w:t>
+      </w:r>
+    </w:p>
+    <w:p>
+      <w:pPr>
+        <w:pStyle w:val="ListBullet"/>
+        <w:spacing w:before="0" w:after="20" w:line="260" w:lineRule="exact"/>
+      </w:pPr>
+      <w:r>
+        <w:rPr>
+          <w:rFonts w:ascii="Calibri" w:hAnsi="Calibri"/>
+          <w:color w:val="1A1A1A"/>
+          <w:sz w:val="20"/>
+        </w:rPr>
+        <w:t>Developed sample size and statistical analysis plans for observational studies, budget impact models, network meta-analyses, and cluster-randomized pragmatic trials</w:t>
+      </w:r>
+    </w:p>
+    <w:p>
+      <w:pPr>
+        <w:pStyle w:val="ListBullet"/>
+        <w:spacing w:before="0" w:after="20" w:line="260" w:lineRule="exact"/>
+      </w:pPr>
+      <w:r>
+        <w:rPr>
+          <w:rFonts w:ascii="Calibri" w:hAnsi="Calibri"/>
+          <w:color w:val="1A1A1A"/>
+          <w:sz w:val="20"/>
+        </w:rPr>
+        <w:t>Worked with CROs and external vendors (Aetion, IQVIA, Evidera, IBM Truven)</w:t>
+      </w:r>
+    </w:p>
+    <w:p>
+      <w:pPr>
+        <w:pStyle w:val="ListBullet"/>
+        <w:spacing w:before="0" w:after="20" w:line="260" w:lineRule="exact"/>
+      </w:pPr>
+      <w:r>
+        <w:rPr>
+          <w:rFonts w:ascii="Calibri" w:hAnsi="Calibri"/>
+          <w:color w:val="1A1A1A"/>
+          <w:sz w:val="20"/>
+        </w:rPr>
+        <w:t>Trained junior scientists on Canadian kidney registry analysis and real-time data visualization using SAS, Tableau, and Adobe Creative Cloud</w:t>
+      </w:r>
+    </w:p>
+    <w:p>
+      <w:pPr>
+        <w:spacing w:before="120" w:after="20"/>
+      </w:pPr>
+      <w:r>
+        <w:rPr>
+          <w:rFonts w:ascii="Calibri" w:hAnsi="Calibri"/>
+          <w:b/>
+          <w:color w:val="1A1A1A"/>
+          <w:sz w:val="20"/>
+        </w:rPr>
+        <w:t>Evidence-Based Medical Analyst</w:t>
+      </w:r>
+      <w:r>
+        <w:rPr>
+          <w:rFonts w:ascii="Calibri" w:hAnsi="Calibri"/>
+          <w:color w:val="555555"/>
+          <w:sz w:val="20"/>
+        </w:rPr>
+        <w:t xml:space="preserve"> | </w:t>
+      </w:r>
+      <w:r>
+        <w:rPr>
+          <w:rFonts w:ascii="Calibri" w:hAnsi="Calibri"/>
+          <w:color w:val="1A1A1A"/>
+          <w:sz w:val="20"/>
+        </w:rPr>
+        <w:t>Fresenius Medical Care North America</w:t>
+      </w:r>
+    </w:p>
+    <w:p>
+      <w:pPr>
+        <w:spacing w:before="0" w:after="40"/>
+      </w:pPr>
+      <w:r>
+        <w:rPr>
+          <w:rFonts w:ascii="Calibri" w:hAnsi="Calibri"/>
+          <w:i/>
+          <w:color w:val="555555"/>
+          <w:sz w:val="18"/>
+        </w:rPr>
+        <w:t>Feb 2015 – Jan 2018</w:t>
+      </w:r>
+    </w:p>
+    <w:p>
+      <w:pPr>
+        <w:pStyle w:val="ListBullet"/>
+        <w:spacing w:before="0" w:after="20" w:line="260" w:lineRule="exact"/>
+      </w:pPr>
+      <w:r>
+        <w:rPr>
+          <w:rFonts w:ascii="Calibri" w:hAnsi="Calibri"/>
+          <w:color w:val="1A1A1A"/>
+          <w:sz w:val="20"/>
+        </w:rPr>
+        <w:t>Conducted comparative effectiveness research on dialysis therapies, cardiorenal drugs, and devices</w:t>
+      </w:r>
+    </w:p>
+    <w:p>
+      <w:pPr>
+        <w:pStyle w:val="ListBullet"/>
+        <w:spacing w:before="0" w:after="20" w:line="260" w:lineRule="exact"/>
+      </w:pPr>
+      <w:r>
+        <w:rPr>
+          <w:rFonts w:ascii="Calibri" w:hAnsi="Calibri"/>
+          <w:color w:val="1A1A1A"/>
+          <w:sz w:val="20"/>
+        </w:rPr>
+        <w:t>Led publication of peer-reviewed manuscripts, research reports, and scientific posters</w:t>
+      </w:r>
+    </w:p>
+    <w:p>
+      <w:pPr>
+        <w:pStyle w:val="ListBullet"/>
+        <w:spacing w:before="0" w:after="20" w:line="260" w:lineRule="exact"/>
+      </w:pPr>
+      <w:r>
+        <w:rPr>
+          <w:rFonts w:ascii="Calibri" w:hAnsi="Calibri"/>
+          <w:color w:val="1A1A1A"/>
+          <w:sz w:val="20"/>
+        </w:rPr>
+        <w:t>Prepared AMCP dossiers for FDA regulatory submissions</w:t>
+      </w:r>
+    </w:p>
+    <w:p>
+      <w:pPr>
+        <w:pStyle w:val="ListBullet"/>
+        <w:spacing w:before="0" w:after="20" w:line="260" w:lineRule="exact"/>
+      </w:pPr>
+      <w:r>
+        <w:rPr>
+          <w:rFonts w:ascii="Calibri" w:hAnsi="Calibri"/>
+          <w:color w:val="1A1A1A"/>
+          <w:sz w:val="20"/>
+        </w:rPr>
+        <w:t>Developed pharmacoepidemiologic dashboards to monitor safety and efficacy of marketed renal therapies</w:t>
+      </w:r>
     </w:p>
     <w:p>
       <w:pPr>

</xml_diff>